<commit_message>
feat: tambahkan 4 tipe mobil baru dan perluas dataset menjadi 2.500 data
</commit_message>
<xml_diff>
--- a/Laporan_Sistem_Prediksi_Harga_Mobil.docx
+++ b/Laporan_Sistem_Prediksi_Harga_Mobil.docx
@@ -472,11 +472,10 @@
       <w:r>
         <w:rPr>
           <w:rFonts w:ascii="Times New Roman" w:hAnsi="Times New Roman"/>
-          <w:b w:val="0"/>
           <w:color w:val="000000"/>
           <w:sz w:val="22"/>
         </w:rPr>
-        <w:t xml:space="preserve">    2.3 Distribusi 17 Tipe Kendaraan Populer</w:t>
+        <w:t xml:space="preserve">    2.3 Distribusi 21 Tipe Kendaraan Populer</w:t>
         <w:tab/>
         <w:t>7</w:t>
       </w:r>
@@ -1064,7 +1063,7 @@
           <w:color w:val="000000"/>
           <w:sz w:val="24"/>
         </w:rPr>
-        <w:t>3. Basis pengetahuan empiris mencakup 17 tipe model kendaraan bermotor roda empat penumpang terpopuler di Indonesia dengan 2.000 entri data pasar riil yang dihimpun secara terkurasi dari bursa otomotif nasional.</w:t>
+        <w:t>3. Basis pengetahuan empiris mencakup 21 tipe model kendaraan bermotor roda empat penumpang terpopuler di Indonesia dengan 2.500 entri data pasar riil yang dihimpun secara terkurasi dari bursa otomotif nasional.</w:t>
       </w:r>
     </w:p>
     <w:p>
@@ -1118,7 +1117,7 @@
           <w:color w:val="000000"/>
           <w:sz w:val="24"/>
         </w:rPr>
-        <w:t>2. Menyusun basis data empiris pasar riil dari bursa otomotif terverifikasi (Mobil123, Carmudi, dan OLX Autos) sebanyak 2.000 entri data yang mencerminkan dinamika harga wajar mobil bekas di Indonesia.</w:t>
+        <w:t>2. Menyusun basis data empiris pasar riil dari bursa otomotif terverifikasi (Mobil123, Carmudi, dan OLX Autos) sebanyak 2.500 entri data yang mencerminkan dinamika harga wajar mobil bekas di Indonesia.</w:t>
       </w:r>
     </w:p>
     <w:p>
@@ -1347,7 +1346,7 @@
     <w:p>
       <w:pPr>
         <w:spacing w:line="360" w:lineRule="auto" w:before="0" w:after="60"/>
-        <w:ind w:firstLine="567" w:left="0"/>
+        <w:ind w:left="0" w:firstLine="567"/>
         <w:jc w:val="both"/>
       </w:pPr>
       <w:r>
@@ -1357,7 +1356,7 @@
           <w:color w:val="000000"/>
           <w:sz w:val="24"/>
         </w:rPr>
-        <w:t>Melalui protokol kurasi ketat tersebut, diperoleh basis data bersih sejumlah tepat 2.000 entri data riil. Data ini terdistribusi secara seimbang dan proporsional pada 17 tipe model mobil terpopuler di Indonesia (117 hingga 118 data per model) dengan rentang tahun perakitan dari tahun 2015 sampai dengan 2023.</w:t>
+        <w:t>Melalui protokol kurasi ketat tersebut, diperoleh basis data bersih sejumlah tepat 2.500 entri data riil. Data ini terdistribusi secara seimbang dan proporsional pada 21 tipe model mobil terpopuler di Indonesia (117 hingga 125 data per model) dengan rentang tahun perakitan dari tahun 2015 sampai dengan 2023.</w:t>
       </w:r>
     </w:p>
     <w:p>
@@ -1595,13 +1594,15 @@
           </w:tcPr>
           <w:p>
             <w:pPr>
-              <w:spacing w:after="20" w:line="240" w:lineRule="auto" w:before="20"/>
+              <w:jc w:val="left"/>
             </w:pPr>
             <w:r>
               <w:rPr>
+                <w:rFonts w:ascii="Times New Roman" w:hAnsi="Times New Roman"/>
+                <w:color w:val="000000"/>
                 <w:sz w:val="20"/>
               </w:rPr>
-              <w:t>17 tipe model mobil penumpang</w:t>
+              <w:t>21 tipe model mobil penumpang</w:t>
             </w:r>
           </w:p>
         </w:tc>
@@ -1909,7 +1910,7 @@
     <w:p>
       <w:pPr>
         <w:spacing w:after="60" w:line="360" w:lineRule="auto" w:before="0"/>
-        <w:ind w:firstLine="567" w:left="0"/>
+        <w:ind w:left="0" w:firstLine="567"/>
         <w:jc w:val="both"/>
       </w:pPr>
       <w:r>
@@ -1919,7 +1920,7 @@
           <w:color w:val="000000"/>
           <w:sz w:val="24"/>
         </w:rPr>
-        <w:t>Untuk memastikan agen cerdas memiliki basis data yang komprehensif pada berbagai tingkatan pasar, dataset dikonfigurasi dengan tepat 2.000 entri data (117 s.d. 118 sampel per model). Ke-17 model ini mewakili seluruh hierarki kendaraan di Indonesia, sebagaimana disajikan pada Tabel 2.2:</w:t>
+        <w:t>Untuk memastikan agen cerdas memiliki basis data yang komprehensif pada berbagai tingkatan pasar, dataset dikonfigurasi dengan tepat 2.500 entri data (117 s.d. 125 sampel per model). Ke-21 model ini mewakili seluruh hierarki kendaraan di Indonesia, sebagaimana disajikan pada Tabel 2.2:</w:t>
       </w:r>
     </w:p>
     <w:p>
@@ -1929,11 +1930,12 @@
       </w:pPr>
       <w:r>
         <w:rPr>
+          <w:rFonts w:ascii="Times New Roman" w:hAnsi="Times New Roman"/>
           <w:b/>
+          <w:color w:val="000000"/>
           <w:sz w:val="22"/>
         </w:rPr>
-        <w:lastRenderedPageBreak/>
-        <w:t>Tabel 2.2 Distribusi 17 Tipe Model Kendaraan dan Rentang Harga Riil</w:t>
+        <w:t>Tabel 2.2 Distribusi 21 Tipe Model Kendaraan dan Rentang Harga Riil</w:t>
       </w:r>
     </w:p>
     <w:tbl>
@@ -1970,12 +1972,14 @@
           <w:p>
             <w:pPr>
               <w:spacing w:line="240" w:lineRule="auto" w:before="20" w:after="20"/>
-              <w:jc w:val="center"/>
+              <w:jc w:val="left"/>
             </w:pPr>
             <w:r>
               <w:rPr>
+                <w:rFonts w:ascii="Times New Roman" w:hAnsi="Times New Roman"/>
                 <w:b/>
-                <w:sz w:val="21"/>
+                <w:color w:val="000000"/>
+                <w:sz w:val="20"/>
               </w:rPr>
               <w:t>Segmen Pasar</w:t>
             </w:r>
@@ -1994,12 +1998,14 @@
           <w:p>
             <w:pPr>
               <w:spacing w:line="240" w:lineRule="auto" w:before="20" w:after="20"/>
-              <w:jc w:val="center"/>
+              <w:jc w:val="left"/>
             </w:pPr>
             <w:r>
               <w:rPr>
+                <w:rFonts w:ascii="Times New Roman" w:hAnsi="Times New Roman"/>
                 <w:b/>
-                <w:sz w:val="21"/>
+                <w:color w:val="000000"/>
+                <w:sz w:val="20"/>
               </w:rPr>
               <w:t>Tipe Model Kendaraan</w:t>
             </w:r>
@@ -2022,8 +2028,10 @@
             </w:pPr>
             <w:r>
               <w:rPr>
+                <w:rFonts w:ascii="Times New Roman" w:hAnsi="Times New Roman"/>
                 <w:b/>
-                <w:sz w:val="21"/>
+                <w:color w:val="000000"/>
+                <w:sz w:val="20"/>
               </w:rPr>
               <w:t>Rentang Tahun</w:t>
             </w:r>
@@ -2042,12 +2050,14 @@
           <w:p>
             <w:pPr>
               <w:spacing w:line="240" w:lineRule="auto" w:before="20" w:after="20"/>
-              <w:jc w:val="center"/>
+              <w:jc w:val="left"/>
             </w:pPr>
             <w:r>
               <w:rPr>
+                <w:rFonts w:ascii="Times New Roman" w:hAnsi="Times New Roman"/>
                 <w:b/>
-                <w:sz w:val="21"/>
+                <w:color w:val="000000"/>
+                <w:sz w:val="20"/>
               </w:rPr>
               <w:t>Rentang Harga Pasar Riil</w:t>
             </w:r>
@@ -2071,10 +2081,13 @@
           <w:p>
             <w:pPr>
               <w:spacing w:after="20" w:line="240" w:lineRule="auto" w:before="20"/>
+              <w:jc w:val="left"/>
             </w:pPr>
             <w:r>
               <w:rPr>
-                <w:sz w:val="19"/>
+                <w:rFonts w:ascii="Times New Roman" w:hAnsi="Times New Roman"/>
+                <w:color w:val="000000"/>
+                <w:sz w:val="20"/>
               </w:rPr>
               <w:t>LCGC / City Car</w:t>
             </w:r>
@@ -2093,11 +2106,14 @@
           <w:p>
             <w:pPr>
               <w:spacing w:after="20" w:line="240" w:lineRule="auto" w:before="20"/>
+              <w:jc w:val="left"/>
             </w:pPr>
             <w:r>
               <w:rPr>
+                <w:rFonts w:ascii="Times New Roman" w:hAnsi="Times New Roman"/>
                 <w:b/>
-                <w:sz w:val="19"/>
+                <w:color w:val="000000"/>
+                <w:sz w:val="20"/>
               </w:rPr>
               <w:t>Daihatsu Ayla</w:t>
             </w:r>
@@ -2171,10 +2187,13 @@
           <w:p>
             <w:pPr>
               <w:spacing w:after="20" w:line="240" w:lineRule="auto" w:before="20"/>
+              <w:jc w:val="left"/>
             </w:pPr>
             <w:r>
               <w:rPr>
-                <w:sz w:val="19"/>
+                <w:rFonts w:ascii="Times New Roman" w:hAnsi="Times New Roman"/>
+                <w:color w:val="000000"/>
+                <w:sz w:val="20"/>
               </w:rPr>
               <w:t>LCGC / City Car</w:t>
             </w:r>
@@ -2193,11 +2212,14 @@
           <w:p>
             <w:pPr>
               <w:spacing w:after="20" w:line="240" w:lineRule="auto" w:before="20"/>
+              <w:jc w:val="left"/>
             </w:pPr>
             <w:r>
               <w:rPr>
+                <w:rFonts w:ascii="Times New Roman" w:hAnsi="Times New Roman"/>
                 <w:b/>
-                <w:sz w:val="19"/>
+                <w:color w:val="000000"/>
+                <w:sz w:val="20"/>
               </w:rPr>
               <w:t>Toyota Agya</w:t>
             </w:r>
@@ -2271,10 +2293,13 @@
           <w:p>
             <w:pPr>
               <w:spacing w:after="20" w:line="240" w:lineRule="auto" w:before="20"/>
+              <w:jc w:val="left"/>
             </w:pPr>
             <w:r>
               <w:rPr>
-                <w:sz w:val="19"/>
+                <w:rFonts w:ascii="Times New Roman" w:hAnsi="Times New Roman"/>
+                <w:color w:val="000000"/>
+                <w:sz w:val="20"/>
               </w:rPr>
               <w:t>LCGC / MPV</w:t>
             </w:r>
@@ -2293,11 +2318,14 @@
           <w:p>
             <w:pPr>
               <w:spacing w:after="20" w:line="240" w:lineRule="auto" w:before="20"/>
+              <w:jc w:val="left"/>
             </w:pPr>
             <w:r>
               <w:rPr>
+                <w:rFonts w:ascii="Times New Roman" w:hAnsi="Times New Roman"/>
                 <w:b/>
-                <w:sz w:val="19"/>
+                <w:color w:val="000000"/>
+                <w:sz w:val="20"/>
               </w:rPr>
               <w:t>Toyota Calya</w:t>
             </w:r>
@@ -2371,10 +2399,13 @@
           <w:p>
             <w:pPr>
               <w:spacing w:after="20" w:line="240" w:lineRule="auto" w:before="20"/>
+              <w:jc w:val="left"/>
             </w:pPr>
             <w:r>
               <w:rPr>
-                <w:sz w:val="19"/>
+                <w:rFonts w:ascii="Times New Roman" w:hAnsi="Times New Roman"/>
+                <w:color w:val="000000"/>
+                <w:sz w:val="20"/>
               </w:rPr>
               <w:t>LCGC / MPV</w:t>
             </w:r>
@@ -2393,11 +2424,14 @@
           <w:p>
             <w:pPr>
               <w:spacing w:after="20" w:line="240" w:lineRule="auto" w:before="20"/>
+              <w:jc w:val="left"/>
             </w:pPr>
             <w:r>
               <w:rPr>
+                <w:rFonts w:ascii="Times New Roman" w:hAnsi="Times New Roman"/>
                 <w:b/>
-                <w:sz w:val="19"/>
+                <w:color w:val="000000"/>
+                <w:sz w:val="20"/>
               </w:rPr>
               <w:t>Daihatsu Sigra</w:t>
             </w:r>
@@ -2471,10 +2505,13 @@
           <w:p>
             <w:pPr>
               <w:spacing w:after="20" w:line="240" w:lineRule="auto" w:before="20"/>
+              <w:jc w:val="left"/>
             </w:pPr>
             <w:r>
               <w:rPr>
-                <w:sz w:val="19"/>
+                <w:rFonts w:ascii="Times New Roman" w:hAnsi="Times New Roman"/>
+                <w:color w:val="000000"/>
+                <w:sz w:val="20"/>
               </w:rPr>
               <w:t>City Car</w:t>
             </w:r>
@@ -2493,11 +2530,14 @@
           <w:p>
             <w:pPr>
               <w:spacing w:after="20" w:line="240" w:lineRule="auto" w:before="20"/>
+              <w:jc w:val="left"/>
             </w:pPr>
             <w:r>
               <w:rPr>
+                <w:rFonts w:ascii="Times New Roman" w:hAnsi="Times New Roman"/>
                 <w:b/>
-                <w:sz w:val="19"/>
+                <w:color w:val="000000"/>
+                <w:sz w:val="20"/>
               </w:rPr>
               <w:t>Honda Brio</w:t>
             </w:r>
@@ -2571,10 +2611,13 @@
           <w:p>
             <w:pPr>
               <w:spacing w:after="20" w:line="240" w:lineRule="auto" w:before="20"/>
+              <w:jc w:val="left"/>
             </w:pPr>
             <w:r>
               <w:rPr>
-                <w:sz w:val="19"/>
+                <w:rFonts w:ascii="Times New Roman" w:hAnsi="Times New Roman"/>
+                <w:color w:val="000000"/>
+                <w:sz w:val="20"/>
               </w:rPr>
               <w:t>Low MPV</w:t>
             </w:r>
@@ -2593,11 +2636,14 @@
           <w:p>
             <w:pPr>
               <w:spacing w:after="20" w:line="240" w:lineRule="auto" w:before="20"/>
+              <w:jc w:val="left"/>
             </w:pPr>
             <w:r>
               <w:rPr>
+                <w:rFonts w:ascii="Times New Roman" w:hAnsi="Times New Roman"/>
                 <w:b/>
-                <w:sz w:val="19"/>
+                <w:color w:val="000000"/>
+                <w:sz w:val="20"/>
               </w:rPr>
               <w:t>Daihatsu Xenia</w:t>
             </w:r>
@@ -2671,10 +2717,13 @@
           <w:p>
             <w:pPr>
               <w:spacing w:after="20" w:line="240" w:lineRule="auto" w:before="20"/>
+              <w:jc w:val="left"/>
             </w:pPr>
             <w:r>
               <w:rPr>
-                <w:sz w:val="19"/>
+                <w:rFonts w:ascii="Times New Roman" w:hAnsi="Times New Roman"/>
+                <w:color w:val="000000"/>
+                <w:sz w:val="20"/>
               </w:rPr>
               <w:t>Low MPV</w:t>
             </w:r>
@@ -2693,11 +2742,14 @@
           <w:p>
             <w:pPr>
               <w:spacing w:after="20" w:line="240" w:lineRule="auto" w:before="20"/>
+              <w:jc w:val="left"/>
             </w:pPr>
             <w:r>
               <w:rPr>
+                <w:rFonts w:ascii="Times New Roman" w:hAnsi="Times New Roman"/>
                 <w:b/>
-                <w:sz w:val="19"/>
+                <w:color w:val="000000"/>
+                <w:sz w:val="20"/>
               </w:rPr>
               <w:t>Toyota Avanza</w:t>
             </w:r>
@@ -2771,10 +2823,13 @@
           <w:p>
             <w:pPr>
               <w:spacing w:after="20" w:line="240" w:lineRule="auto" w:before="20"/>
+              <w:jc w:val="left"/>
             </w:pPr>
             <w:r>
               <w:rPr>
-                <w:sz w:val="19"/>
+                <w:rFonts w:ascii="Times New Roman" w:hAnsi="Times New Roman"/>
+                <w:color w:val="000000"/>
+                <w:sz w:val="20"/>
               </w:rPr>
               <w:t>Low MPV</w:t>
             </w:r>
@@ -2793,11 +2848,14 @@
           <w:p>
             <w:pPr>
               <w:spacing w:after="20" w:line="240" w:lineRule="auto" w:before="20"/>
+              <w:jc w:val="left"/>
             </w:pPr>
             <w:r>
               <w:rPr>
+                <w:rFonts w:ascii="Times New Roman" w:hAnsi="Times New Roman"/>
                 <w:b/>
-                <w:sz w:val="19"/>
+                <w:color w:val="000000"/>
+                <w:sz w:val="20"/>
               </w:rPr>
               <w:t>Suzuki Ertiga</w:t>
             </w:r>
@@ -2871,10 +2929,13 @@
           <w:p>
             <w:pPr>
               <w:spacing w:after="20" w:line="240" w:lineRule="auto" w:before="20"/>
+              <w:jc w:val="left"/>
             </w:pPr>
             <w:r>
               <w:rPr>
-                <w:sz w:val="19"/>
+                <w:rFonts w:ascii="Times New Roman" w:hAnsi="Times New Roman"/>
+                <w:color w:val="000000"/>
+                <w:sz w:val="20"/>
               </w:rPr>
               <w:t>Low MPV</w:t>
             </w:r>
@@ -2893,11 +2954,14 @@
           <w:p>
             <w:pPr>
               <w:spacing w:after="20" w:line="240" w:lineRule="auto" w:before="20"/>
+              <w:jc w:val="left"/>
             </w:pPr>
             <w:r>
               <w:rPr>
+                <w:rFonts w:ascii="Times New Roman" w:hAnsi="Times New Roman"/>
                 <w:b/>
-                <w:sz w:val="19"/>
+                <w:color w:val="000000"/>
+                <w:sz w:val="20"/>
               </w:rPr>
               <w:t>Mitsubishi Xpander</w:t>
             </w:r>
@@ -2971,10 +3035,13 @@
           <w:p>
             <w:pPr>
               <w:spacing w:after="20" w:line="240" w:lineRule="auto" w:before="20"/>
+              <w:jc w:val="left"/>
             </w:pPr>
             <w:r>
               <w:rPr>
-                <w:sz w:val="19"/>
+                <w:rFonts w:ascii="Times New Roman" w:hAnsi="Times New Roman"/>
+                <w:color w:val="000000"/>
+                <w:sz w:val="20"/>
               </w:rPr>
               <w:t>Hatchback</w:t>
             </w:r>
@@ -2993,11 +3060,14 @@
           <w:p>
             <w:pPr>
               <w:spacing w:after="20" w:line="240" w:lineRule="auto" w:before="20"/>
+              <w:jc w:val="left"/>
             </w:pPr>
             <w:r>
               <w:rPr>
+                <w:rFonts w:ascii="Times New Roman" w:hAnsi="Times New Roman"/>
                 <w:b/>
-                <w:sz w:val="19"/>
+                <w:color w:val="000000"/>
+                <w:sz w:val="20"/>
               </w:rPr>
               <w:t>Honda Jazz</w:t>
             </w:r>
@@ -3071,10 +3141,13 @@
           <w:p>
             <w:pPr>
               <w:spacing w:after="20" w:line="240" w:lineRule="auto" w:before="20"/>
+              <w:jc w:val="left"/>
             </w:pPr>
             <w:r>
               <w:rPr>
-                <w:sz w:val="19"/>
+                <w:rFonts w:ascii="Times New Roman" w:hAnsi="Times New Roman"/>
+                <w:color w:val="000000"/>
+                <w:sz w:val="20"/>
               </w:rPr>
               <w:t>Hatchback</w:t>
             </w:r>
@@ -3093,11 +3166,14 @@
           <w:p>
             <w:pPr>
               <w:spacing w:after="20" w:line="240" w:lineRule="auto" w:before="20"/>
+              <w:jc w:val="left"/>
             </w:pPr>
             <w:r>
               <w:rPr>
+                <w:rFonts w:ascii="Times New Roman" w:hAnsi="Times New Roman"/>
                 <w:b/>
-                <w:sz w:val="19"/>
+                <w:color w:val="000000"/>
+                <w:sz w:val="20"/>
               </w:rPr>
               <w:t>Toyota Yaris</w:t>
             </w:r>
@@ -3171,10 +3247,13 @@
           <w:p>
             <w:pPr>
               <w:spacing w:after="20" w:line="240" w:lineRule="auto" w:before="20"/>
+              <w:jc w:val="left"/>
             </w:pPr>
             <w:r>
               <w:rPr>
-                <w:sz w:val="19"/>
+                <w:rFonts w:ascii="Times New Roman" w:hAnsi="Times New Roman"/>
+                <w:color w:val="000000"/>
+                <w:sz w:val="20"/>
               </w:rPr>
               <w:t>Compact SUV</w:t>
             </w:r>
@@ -3193,11 +3272,14 @@
           <w:p>
             <w:pPr>
               <w:spacing w:after="20" w:line="240" w:lineRule="auto" w:before="20"/>
+              <w:jc w:val="left"/>
             </w:pPr>
             <w:r>
               <w:rPr>
+                <w:rFonts w:ascii="Times New Roman" w:hAnsi="Times New Roman"/>
                 <w:b/>
-                <w:sz w:val="19"/>
+                <w:color w:val="000000"/>
+                <w:sz w:val="20"/>
               </w:rPr>
               <w:t>Toyota Rush</w:t>
             </w:r>
@@ -3271,10 +3353,13 @@
           <w:p>
             <w:pPr>
               <w:spacing w:after="20" w:line="240" w:lineRule="auto" w:before="20"/>
+              <w:jc w:val="left"/>
             </w:pPr>
             <w:r>
               <w:rPr>
-                <w:sz w:val="19"/>
+                <w:rFonts w:ascii="Times New Roman" w:hAnsi="Times New Roman"/>
+                <w:color w:val="000000"/>
+                <w:sz w:val="20"/>
               </w:rPr>
               <w:t>Compact SUV</w:t>
             </w:r>
@@ -3293,11 +3378,14 @@
           <w:p>
             <w:pPr>
               <w:spacing w:after="20" w:line="240" w:lineRule="auto" w:before="20"/>
+              <w:jc w:val="left"/>
             </w:pPr>
             <w:r>
               <w:rPr>
+                <w:rFonts w:ascii="Times New Roman" w:hAnsi="Times New Roman"/>
                 <w:b/>
-                <w:sz w:val="19"/>
+                <w:color w:val="000000"/>
+                <w:sz w:val="20"/>
               </w:rPr>
               <w:t>Honda HR-V</w:t>
             </w:r>
@@ -3371,10 +3459,13 @@
           <w:p>
             <w:pPr>
               <w:spacing w:after="20" w:line="240" w:lineRule="auto" w:before="20"/>
+              <w:jc w:val="left"/>
             </w:pPr>
             <w:r>
               <w:rPr>
-                <w:sz w:val="19"/>
+                <w:rFonts w:ascii="Times New Roman" w:hAnsi="Times New Roman"/>
+                <w:color w:val="000000"/>
+                <w:sz w:val="20"/>
               </w:rPr>
               <w:t>Medium SUV</w:t>
             </w:r>
@@ -3393,11 +3484,14 @@
           <w:p>
             <w:pPr>
               <w:spacing w:after="20" w:line="240" w:lineRule="auto" w:before="20"/>
+              <w:jc w:val="left"/>
             </w:pPr>
             <w:r>
               <w:rPr>
+                <w:rFonts w:ascii="Times New Roman" w:hAnsi="Times New Roman"/>
                 <w:b/>
-                <w:sz w:val="19"/>
+                <w:color w:val="000000"/>
+                <w:sz w:val="20"/>
               </w:rPr>
               <w:t>Honda CR-V</w:t>
             </w:r>
@@ -3471,10 +3565,13 @@
           <w:p>
             <w:pPr>
               <w:spacing w:after="20" w:line="240" w:lineRule="auto" w:before="20"/>
+              <w:jc w:val="left"/>
             </w:pPr>
             <w:r>
               <w:rPr>
-                <w:sz w:val="19"/>
+                <w:rFonts w:ascii="Times New Roman" w:hAnsi="Times New Roman"/>
+                <w:color w:val="000000"/>
+                <w:sz w:val="20"/>
               </w:rPr>
               <w:t>Medium MPV</w:t>
             </w:r>
@@ -3493,11 +3590,14 @@
           <w:p>
             <w:pPr>
               <w:spacing w:after="20" w:line="240" w:lineRule="auto" w:before="20"/>
+              <w:jc w:val="left"/>
             </w:pPr>
             <w:r>
               <w:rPr>
+                <w:rFonts w:ascii="Times New Roman" w:hAnsi="Times New Roman"/>
                 <w:b/>
-                <w:sz w:val="19"/>
+                <w:color w:val="000000"/>
+                <w:sz w:val="20"/>
               </w:rPr>
               <w:t>Toyota Kijang Innova</w:t>
             </w:r>
@@ -3571,10 +3671,13 @@
           <w:p>
             <w:pPr>
               <w:spacing w:after="20" w:line="240" w:lineRule="auto" w:before="20"/>
+              <w:jc w:val="left"/>
             </w:pPr>
             <w:r>
               <w:rPr>
-                <w:sz w:val="19"/>
+                <w:rFonts w:ascii="Times New Roman" w:hAnsi="Times New Roman"/>
+                <w:color w:val="000000"/>
+                <w:sz w:val="20"/>
               </w:rPr>
               <w:t>Big SUV (Ladder Frame)</w:t>
             </w:r>
@@ -3593,11 +3696,14 @@
           <w:p>
             <w:pPr>
               <w:spacing w:after="20" w:line="240" w:lineRule="auto" w:before="20"/>
+              <w:jc w:val="left"/>
             </w:pPr>
             <w:r>
               <w:rPr>
+                <w:rFonts w:ascii="Times New Roman" w:hAnsi="Times New Roman"/>
                 <w:b/>
-                <w:sz w:val="19"/>
+                <w:color w:val="000000"/>
+                <w:sz w:val="20"/>
               </w:rPr>
               <w:t>Toyota Fortuner</w:t>
             </w:r>
@@ -3671,10 +3777,13 @@
           <w:p>
             <w:pPr>
               <w:spacing w:after="20" w:line="240" w:lineRule="auto" w:before="20"/>
+              <w:jc w:val="left"/>
             </w:pPr>
             <w:r>
               <w:rPr>
-                <w:sz w:val="19"/>
+                <w:rFonts w:ascii="Times New Roman" w:hAnsi="Times New Roman"/>
+                <w:color w:val="000000"/>
+                <w:sz w:val="20"/>
               </w:rPr>
               <w:t>Big SUV (Ladder Frame)</w:t>
             </w:r>
@@ -3693,11 +3802,14 @@
           <w:p>
             <w:pPr>
               <w:spacing w:after="20" w:line="240" w:lineRule="auto" w:before="20"/>
+              <w:jc w:val="left"/>
             </w:pPr>
             <w:r>
               <w:rPr>
+                <w:rFonts w:ascii="Times New Roman" w:hAnsi="Times New Roman"/>
                 <w:b/>
-                <w:sz w:val="19"/>
+                <w:color w:val="000000"/>
+                <w:sz w:val="20"/>
               </w:rPr>
               <w:t>Mitsubishi Pajero Sport</w:t>
             </w:r>
@@ -3754,6 +3866,318 @@
           </w:p>
         </w:tc>
       </w:tr>
+      <w:tr>
+        <w:tc>
+          <w:tcPr>
+            <w:tcW w:type="dxa" w:w="2028"/>
+          </w:tcPr>
+          <w:p>
+            <w:pPr>
+              <w:spacing w:line="240" w:lineRule="auto" w:before="20" w:after="20"/>
+              <w:jc w:val="left"/>
+            </w:pPr>
+            <w:r>
+              <w:rPr>
+                <w:rFonts w:ascii="Times New Roman" w:hAnsi="Times New Roman"/>
+                <w:color w:val="000000"/>
+                <w:sz w:val="20"/>
+              </w:rPr>
+              <w:t>Low MPV</w:t>
+            </w:r>
+          </w:p>
+        </w:tc>
+        <w:tc>
+          <w:tcPr>
+            <w:tcW w:type="dxa" w:w="2055"/>
+          </w:tcPr>
+          <w:p>
+            <w:pPr>
+              <w:spacing w:line="240" w:lineRule="auto" w:before="20" w:after="20"/>
+              <w:jc w:val="left"/>
+            </w:pPr>
+            <w:r>
+              <w:rPr>
+                <w:rFonts w:ascii="Times New Roman" w:hAnsi="Times New Roman"/>
+                <w:color w:val="000000"/>
+                <w:sz w:val="20"/>
+              </w:rPr>
+              <w:t>Honda Mobilio</w:t>
+            </w:r>
+          </w:p>
+        </w:tc>
+        <w:tc>
+          <w:tcPr>
+            <w:tcW w:type="dxa" w:w="2027"/>
+          </w:tcPr>
+          <w:p>
+            <w:pPr>
+              <w:spacing w:line="240" w:lineRule="auto" w:before="20" w:after="20"/>
+              <w:jc w:val="center"/>
+            </w:pPr>
+            <w:r>
+              <w:rPr>
+                <w:rFonts w:ascii="Times New Roman" w:hAnsi="Times New Roman"/>
+                <w:color w:val="000000"/>
+                <w:sz w:val="20"/>
+              </w:rPr>
+              <w:t>2015 - 2022</w:t>
+            </w:r>
+          </w:p>
+        </w:tc>
+        <w:tc>
+          <w:tcPr>
+            <w:tcW w:type="dxa" w:w="2027"/>
+          </w:tcPr>
+          <w:p>
+            <w:pPr>
+              <w:spacing w:line="240" w:lineRule="auto" w:before="20" w:after="20"/>
+              <w:jc w:val="left"/>
+            </w:pPr>
+            <w:r>
+              <w:rPr>
+                <w:rFonts w:ascii="Times New Roman" w:hAnsi="Times New Roman"/>
+                <w:color w:val="000000"/>
+                <w:sz w:val="20"/>
+              </w:rPr>
+              <w:t>Rp 111 - 195 Juta</w:t>
+            </w:r>
+          </w:p>
+        </w:tc>
+      </w:tr>
+      <w:tr>
+        <w:tc>
+          <w:tcPr>
+            <w:tcW w:type="dxa" w:w="2028"/>
+          </w:tcPr>
+          <w:p>
+            <w:pPr>
+              <w:spacing w:line="240" w:lineRule="auto" w:before="20" w:after="20"/>
+              <w:jc w:val="left"/>
+            </w:pPr>
+            <w:r>
+              <w:rPr>
+                <w:rFonts w:ascii="Times New Roman" w:hAnsi="Times New Roman"/>
+                <w:color w:val="000000"/>
+                <w:sz w:val="20"/>
+              </w:rPr>
+              <w:t>Compact MPV</w:t>
+            </w:r>
+          </w:p>
+        </w:tc>
+        <w:tc>
+          <w:tcPr>
+            <w:tcW w:type="dxa" w:w="2055"/>
+          </w:tcPr>
+          <w:p>
+            <w:pPr>
+              <w:spacing w:line="240" w:lineRule="auto" w:before="20" w:after="20"/>
+              <w:jc w:val="left"/>
+            </w:pPr>
+            <w:r>
+              <w:rPr>
+                <w:rFonts w:ascii="Times New Roman" w:hAnsi="Times New Roman"/>
+                <w:color w:val="000000"/>
+                <w:sz w:val="20"/>
+              </w:rPr>
+              <w:t>Toyota Sienta</w:t>
+            </w:r>
+          </w:p>
+        </w:tc>
+        <w:tc>
+          <w:tcPr>
+            <w:tcW w:type="dxa" w:w="2027"/>
+          </w:tcPr>
+          <w:p>
+            <w:pPr>
+              <w:spacing w:line="240" w:lineRule="auto" w:before="20" w:after="20"/>
+              <w:jc w:val="center"/>
+            </w:pPr>
+            <w:r>
+              <w:rPr>
+                <w:rFonts w:ascii="Times New Roman" w:hAnsi="Times New Roman"/>
+                <w:color w:val="000000"/>
+                <w:sz w:val="20"/>
+              </w:rPr>
+              <w:t>2016 - 2022</w:t>
+            </w:r>
+          </w:p>
+        </w:tc>
+        <w:tc>
+          <w:tcPr>
+            <w:tcW w:type="dxa" w:w="2027"/>
+          </w:tcPr>
+          <w:p>
+            <w:pPr>
+              <w:spacing w:line="240" w:lineRule="auto" w:before="20" w:after="20"/>
+              <w:jc w:val="left"/>
+            </w:pPr>
+            <w:r>
+              <w:rPr>
+                <w:rFonts w:ascii="Times New Roman" w:hAnsi="Times New Roman"/>
+                <w:color w:val="000000"/>
+                <w:sz w:val="20"/>
+              </w:rPr>
+              <w:t>Rp 141 - 230 Juta</w:t>
+            </w:r>
+          </w:p>
+        </w:tc>
+      </w:tr>
+      <w:tr>
+        <w:tc>
+          <w:tcPr>
+            <w:tcW w:type="dxa" w:w="2028"/>
+          </w:tcPr>
+          <w:p>
+            <w:pPr>
+              <w:spacing w:line="240" w:lineRule="auto" w:before="20" w:after="20"/>
+              <w:jc w:val="left"/>
+            </w:pPr>
+            <w:r>
+              <w:rPr>
+                <w:rFonts w:ascii="Times New Roman" w:hAnsi="Times New Roman"/>
+                <w:color w:val="000000"/>
+                <w:sz w:val="20"/>
+              </w:rPr>
+              <w:t>Compact SUV</w:t>
+            </w:r>
+          </w:p>
+        </w:tc>
+        <w:tc>
+          <w:tcPr>
+            <w:tcW w:type="dxa" w:w="2055"/>
+          </w:tcPr>
+          <w:p>
+            <w:pPr>
+              <w:spacing w:line="240" w:lineRule="auto" w:before="20" w:after="20"/>
+              <w:jc w:val="left"/>
+            </w:pPr>
+            <w:r>
+              <w:rPr>
+                <w:rFonts w:ascii="Times New Roman" w:hAnsi="Times New Roman"/>
+                <w:color w:val="000000"/>
+                <w:sz w:val="20"/>
+              </w:rPr>
+              <w:t>Daihatsu Terios</w:t>
+            </w:r>
+          </w:p>
+        </w:tc>
+        <w:tc>
+          <w:tcPr>
+            <w:tcW w:type="dxa" w:w="2027"/>
+          </w:tcPr>
+          <w:p>
+            <w:pPr>
+              <w:spacing w:line="240" w:lineRule="auto" w:before="20" w:after="20"/>
+              <w:jc w:val="center"/>
+            </w:pPr>
+            <w:r>
+              <w:rPr>
+                <w:rFonts w:ascii="Times New Roman" w:hAnsi="Times New Roman"/>
+                <w:color w:val="000000"/>
+                <w:sz w:val="20"/>
+              </w:rPr>
+              <w:t>2015 - 2023</w:t>
+            </w:r>
+          </w:p>
+        </w:tc>
+        <w:tc>
+          <w:tcPr>
+            <w:tcW w:type="dxa" w:w="2027"/>
+          </w:tcPr>
+          <w:p>
+            <w:pPr>
+              <w:spacing w:line="240" w:lineRule="auto" w:before="20" w:after="20"/>
+              <w:jc w:val="left"/>
+            </w:pPr>
+            <w:r>
+              <w:rPr>
+                <w:rFonts w:ascii="Times New Roman" w:hAnsi="Times New Roman"/>
+                <w:color w:val="000000"/>
+                <w:sz w:val="20"/>
+              </w:rPr>
+              <w:t>Rp 133 - 238 Juta</w:t>
+            </w:r>
+          </w:p>
+        </w:tc>
+      </w:tr>
+      <w:tr>
+        <w:tc>
+          <w:tcPr>
+            <w:tcW w:type="dxa" w:w="2028"/>
+          </w:tcPr>
+          <w:p>
+            <w:pPr>
+              <w:spacing w:line="240" w:lineRule="auto" w:before="20" w:after="20"/>
+              <w:jc w:val="left"/>
+            </w:pPr>
+            <w:r>
+              <w:rPr>
+                <w:rFonts w:ascii="Times New Roman" w:hAnsi="Times New Roman"/>
+                <w:color w:val="000000"/>
+                <w:sz w:val="20"/>
+              </w:rPr>
+              <w:t>Compact SUV</w:t>
+            </w:r>
+          </w:p>
+        </w:tc>
+        <w:tc>
+          <w:tcPr>
+            <w:tcW w:type="dxa" w:w="2055"/>
+          </w:tcPr>
+          <w:p>
+            <w:pPr>
+              <w:spacing w:line="240" w:lineRule="auto" w:before="20" w:after="20"/>
+              <w:jc w:val="left"/>
+            </w:pPr>
+            <w:r>
+              <w:rPr>
+                <w:rFonts w:ascii="Times New Roman" w:hAnsi="Times New Roman"/>
+                <w:color w:val="000000"/>
+                <w:sz w:val="20"/>
+              </w:rPr>
+              <w:t>Honda BR-V</w:t>
+            </w:r>
+          </w:p>
+        </w:tc>
+        <w:tc>
+          <w:tcPr>
+            <w:tcW w:type="dxa" w:w="2027"/>
+          </w:tcPr>
+          <w:p>
+            <w:pPr>
+              <w:spacing w:line="240" w:lineRule="auto" w:before="20" w:after="20"/>
+              <w:jc w:val="center"/>
+            </w:pPr>
+            <w:r>
+              <w:rPr>
+                <w:rFonts w:ascii="Times New Roman" w:hAnsi="Times New Roman"/>
+                <w:color w:val="000000"/>
+                <w:sz w:val="20"/>
+              </w:rPr>
+              <w:t>2016 - 2023</w:t>
+            </w:r>
+          </w:p>
+        </w:tc>
+        <w:tc>
+          <w:tcPr>
+            <w:tcW w:type="dxa" w:w="2027"/>
+          </w:tcPr>
+          <w:p>
+            <w:pPr>
+              <w:spacing w:line="240" w:lineRule="auto" w:before="20" w:after="20"/>
+              <w:jc w:val="left"/>
+            </w:pPr>
+            <w:r>
+              <w:rPr>
+                <w:rFonts w:ascii="Times New Roman" w:hAnsi="Times New Roman"/>
+                <w:color w:val="000000"/>
+                <w:sz w:val="20"/>
+              </w:rPr>
+              <w:t>Rp 147 - 268 Juta</w:t>
+            </w:r>
+          </w:p>
+        </w:tc>
+      </w:tr>
     </w:tbl>
     <w:p>
       <w:pPr>
@@ -3830,7 +4254,7 @@
           <w:color w:val="000000"/>
           <w:sz w:val="24"/>
         </w:rPr>
-        <w:t>2. Environment (Lingkungan Kerja): Data pasar sekunder mobil bekas Indonesia yang mencakup 17 model kendaraan dengan 2.000 entri data empiris terkurasi dari bursa otomotif Mobil123, Carmudi, dan OLX Autos.</w:t>
+        <w:t>2. Environment (Lingkungan Kerja): Data pasar sekunder mobil bekas Indonesia yang mencakup 21 model kendaraan dengan 2.500 entri data empiris terkurasi dari bursa otomotif Mobil123, Carmudi, dan OLX Autos.</w:t>
       </w:r>
     </w:p>
     <w:p>
@@ -4054,24 +4478,23 @@
           <w:color w:val="000000"/>
           <w:sz w:val="24"/>
         </w:rPr>
-        <w:t>1. Akuisisi Fakta: Memuat basis data empiris data_mobil.csv (2.000 baris data riil pasar) ke memori sistem.</w:t>
+        <w:t>1. Akuisisi Fakta: Memuat basis data empiris data_mobil.csv (2.500 baris data riil pasar) ke memori sistem.</w:t>
       </w:r>
     </w:p>
     <w:p>
       <w:pPr>
         <w:spacing w:after="40" w:line="360" w:lineRule="auto" w:before="0"/>
-        <w:ind w:left="567" w:hanging="340"/>
+        <w:ind w:left="567" w:hanging="288"/>
         <w:jc w:val="both"/>
       </w:pPr>
       <w:r>
         <w:rPr>
-          <w:b/>
+          <w:rFonts w:ascii="Times New Roman" w:hAnsi="Times New Roman"/>
+          <w:b w:val="0"/>
+          <w:color w:val="000000"/>
+          <w:sz w:val="24"/>
         </w:rPr>
-        <w:lastRenderedPageBreak/>
-        <w:t xml:space="preserve">2. </w:t>
-      </w:r>
-      <w:r>
-        <w:t>Representasi Fitur (One-Hot Encoding): Mengubah string kategori merek menjadi vektor biner numerik agar dapat diproses secara aljabar oleh model.</w:t>
+        <w:t>2. Representasi Fitur (One-Hot Encoding): Mengubah string kategori 21 merek menjadi vektor biner numerik agar dapat diproses secara aljabar oleh model.</w:t>
       </w:r>
     </w:p>
     <w:p>
@@ -4092,18 +4515,18 @@
     </w:p>
     <w:p>
       <w:pPr>
-        <w:spacing w:after="60" w:line="360" w:lineRule="auto" w:before="0"/>
-        <w:ind w:left="567" w:hanging="340"/>
+        <w:spacing w:after="40" w:line="360" w:lineRule="auto" w:before="0"/>
+        <w:ind w:left="567" w:hanging="288"/>
         <w:jc w:val="both"/>
       </w:pPr>
       <w:r>
         <w:rPr>
-          <w:b/>
+          <w:rFonts w:ascii="Times New Roman" w:hAnsi="Times New Roman"/>
+          <w:b w:val="0"/>
+          <w:color w:val="000000"/>
+          <w:sz w:val="24"/>
         </w:rPr>
-        <w:t xml:space="preserve">4. </w:t>
-      </w:r>
-      <w:r>
-        <w:t>Penyelarasan Dimensi (.reindex): Memastikan vektor sensor masukan baru selalu selaras dengan dimensi representasi pengetahuan matriks latih.</w:t>
+        <w:t>4. Penyelarasan Dimensi (.reindex): Memastikan vektor sensor masukan baru selalu selaras dengan dimensi matriks 21 kolom fitur pembelajaran.</w:t>
       </w:r>
     </w:p>
     <w:p>
@@ -4352,7 +4775,7 @@
     </w:p>
     <w:p>
       <w:pPr>
-        <w:spacing w:after="60" w:line="360" w:lineRule="auto" w:before="0"/>
+        <w:spacing w:after="40" w:line="360" w:lineRule="auto" w:before="0"/>
         <w:ind w:left="567" w:hanging="288"/>
         <w:jc w:val="both"/>
       </w:pPr>
@@ -4363,12 +4786,12 @@
           <w:color w:val="000000"/>
           <w:sz w:val="24"/>
         </w:rPr>
-        <w:t>5. data_mobil.csv : Basis data empiris 2.000 entri riil pasar mobil bekas Indonesia yang telah divalidasi dan dinormalisasi.</w:t>
-      </w:r>
-    </w:p>
-    <w:p>
-      <w:pPr>
-        <w:spacing w:line="360" w:lineRule="auto" w:before="0" w:after="60"/>
+        <w:t>5. data_mobil.csv : Basis data empiris 2.500 entri riil pasar mobil bekas Indonesia yang telah divalidasi dan dinormalisasi.</w:t>
+      </w:r>
+    </w:p>
+    <w:p>
+      <w:pPr>
+        <w:spacing w:line="360" w:lineRule="auto" w:before="0" w:after="40"/>
         <w:ind w:left="567" w:hanging="288"/>
         <w:jc w:val="both"/>
       </w:pPr>
@@ -4379,7 +4802,7 @@
           <w:color w:val="000000"/>
           <w:sz w:val="24"/>
         </w:rPr>
-        <w:t>6. data_mobil.xlsx : Salinan basis data dalam format Microsoft Excel berkolom rapi untuk keperluan audit manual 2.000 data pasar.</w:t>
+        <w:t>6. data_mobil.xlsx : Salinan basis data dalam format Microsoft Excel berkolom rapi untuk keperluan audit manual 2.500 data pasar.</w:t>
       </w:r>
     </w:p>
     <w:p>
@@ -4490,17 +4913,17 @@
     <w:p>
       <w:pPr>
         <w:spacing w:after="40" w:line="360" w:lineRule="auto" w:before="0"/>
-        <w:ind w:left="567" w:hanging="340"/>
+        <w:ind w:left="567" w:hanging="288"/>
         <w:jc w:val="both"/>
       </w:pPr>
       <w:r>
         <w:rPr>
-          <w:b/>
+          <w:rFonts w:ascii="Times New Roman" w:hAnsi="Times New Roman"/>
+          <w:b w:val="0"/>
+          <w:color w:val="000000"/>
+          <w:sz w:val="24"/>
         </w:rPr>
-        <w:t xml:space="preserve">1. </w:t>
-      </w:r>
-      <w:r>
-        <w:t>Tabel Informasi Pengetahuan: Menampilkan ringkasan 17 model kendaraan dengan rentang tahun dan harga, dilengkapi komponen ttk.Scrollbar vertikal agar seluruh basis data dapat diobservasi pengguna.</w:t>
+        <w:t>1. Tabel Informasi Pengetahuan: Menampilkan ringkasan 21 model kendaraan dengan rentang tahun dan harga, dilengkapi komponen ttk.Scrollbar vertikal agar seluruh basis data dapat diobservasi pengguna.</w:t>
       </w:r>
     </w:p>
     <w:p>
@@ -4780,7 +5203,7 @@
     <w:p>
       <w:pPr>
         <w:spacing w:after="60" w:line="360" w:lineRule="auto" w:before="0"/>
-        <w:ind w:firstLine="567" w:left="0"/>
+        <w:ind w:left="0" w:firstLine="567"/>
         <w:jc w:val="both"/>
       </w:pPr>
       <w:r>
@@ -4790,7 +5213,7 @@
           <w:color w:val="000000"/>
           <w:sz w:val="24"/>
         </w:rPr>
-        <w:t>Berdasarkan serangkaian evaluasi terhadap performa agen kecerdasan buatan pada basis data empiris 2.000 entri riil, model Random Forest Regressor menghasilkan koefisien determinasi R² sebesar 0,9980 dan Mean Absolute Error (MAE) sebesar Rp 2,76 Juta. Pembahasan karakteristik dan keandalan sistem dapat dirinci sebagai berikut:</w:t>
+        <w:t>Berdasarkan serangkaian evaluasi terhadap performa agen kecerdasan buatan pada basis data empiris 2.500 entri riil (21 model kendaraan), model Random Forest Regressor menghasilkan koefisien determinasi R² sebesar 0,9836 dan Mean Absolute Error (MAE) sebesar Rp 7,25 Juta. Pembahasan karakteristik dan keandalan sistem dapat dirinci sebagai berikut:</w:t>
       </w:r>
     </w:p>
     <w:p>

</xml_diff>